<commit_message>
docs: expand proposal and verify implemented frontend scope
</commit_message>
<xml_diff>
--- a/docs/proposals/SP25-BSE-013_AIZAZ_NOOR_Proposal.docx
+++ b/docs/proposals/SP25-BSE-013_AIZAZ_NOOR_Proposal.docx
@@ -220,7 +220,6 @@
     <w:p>
       <w:pPr>
         <w:spacing w:after="160"/>
-        <w:jc w:val="left"/>
       </w:pPr>
       <w:r>
         <w:rPr>
@@ -235,20 +234,31 @@
         <w:pStyle w:val="Heading1"/>
       </w:pPr>
       <w:r>
-        <w:t>Project overview</w:t>
+        <w:t>1. Purpose and project boundary</w:t>
       </w:r>
     </w:p>
     <w:p>
       <w:pPr>
         <w:spacing w:after="120"/>
-        <w:jc w:val="left"/>
       </w:pPr>
       <w:r>
         <w:rPr>
           <w:b w:val="0"/>
           <w:sz w:val="21"/>
         </w:rPr>
-        <w:t>NovaWorks will provide a responsive workspace for turning meeting decisions into organized projects and assigned tasks. Based on the repository’s React frontend, the project will help administrators review meeting outcomes, managers inspect assigned projects, and developers understand their tasks, deadlines and estimated effort.</w:t>
+        <w:t>NovaWorks is a meeting-to-execution workspace that organizes agreed decisions into projects and assigned tasks. Its frontend helps an administrator submit a meeting transcript, a project manager review assigned client work, and a developer inspect personal tasks. The objective is a clear, responsive journey from meeting input to readable ownership, deadlines and effort estimates.</w:t>
+      </w:r>
+    </w:p>
+    <w:p>
+      <w:pPr>
+        <w:spacing w:after="120"/>
+      </w:pPr>
+      <w:r>
+        <w:rPr>
+          <w:b w:val="0"/>
+          <w:sz w:val="21"/>
+        </w:rPr>
+        <w:t>This academic proposal covers frontend design and interaction using React 19, Vite, JavaScript, HTML and CSS. Existing APIs may be consumed where available. Backend services, database implementation, authentication infrastructure and AI model development are outside the members’ proposed work. Additional views may use clearly identified sample data, as non-functional mockups are permitted.</w:t>
       </w:r>
     </w:p>
     <w:p>
@@ -256,33 +266,350 @@
         <w:pStyle w:val="Heading1"/>
       </w:pPr>
       <w:r>
-        <w:t>Features and scope</w:t>
+        <w:t>2. Implemented screens and interactive panel</w:t>
       </w:r>
     </w:p>
     <w:p>
       <w:pPr>
         <w:spacing w:after="120"/>
-        <w:jc w:val="left"/>
       </w:pPr>
       <w:r>
         <w:rPr>
           <w:b w:val="0"/>
-          <w:sz w:val="21"/>
+          <w:sz w:val="20"/>
         </w:rPr>
-        <w:t>Key features include role-based navigation, sign-in validation, transcript entry with sample selection, review of extracted projects and tasks, project search and sorting, task filtering, and a searchable team directory. Proposed supporting views will present employee assignments, deadlines, workloads and effort summaries. Clear labels, useful validation, keyboard focus and responsive layouts will support a natural user experience.</w:t>
+        <w:t>Repository review confirms the following six interface units in the source. “Implemented” describes existing UI code, not a fresh verification of every live service. Role variants share components and are not counted as separate screens.</w:t>
+      </w:r>
+    </w:p>
+    <w:tbl>
+      <w:tblPr>
+        <w:tblStyle w:val="LightShading-Accent1"/>
+        <w:tblW w:type="auto" w:w="0"/>
+        <w:tblLook w:firstColumn="1" w:firstRow="1" w:lastColumn="0" w:lastRow="0" w:noHBand="0" w:noVBand="1" w:val="04A0"/>
+      </w:tblPr>
+      <w:tblGrid>
+        <w:gridCol w:w="4874"/>
+        <w:gridCol w:w="4874"/>
+      </w:tblGrid>
+      <w:tr>
+        <w:trPr>
+          <w:cantSplit/>
+        </w:trPr>
+        <w:tc>
+          <w:tcPr>
+            <w:tcW w:type="dxa" w:w="4874"/>
+          </w:tcPr>
+          <w:p>
+            <w:pPr>
+              <w:spacing w:after="80" w:before="60"/>
+            </w:pPr>
+            <w:r>
+              <w:rPr>
+                <w:sz w:val="19"/>
+              </w:rPr>
+              <w:t>Interface</w:t>
+            </w:r>
+          </w:p>
+        </w:tc>
+        <w:tc>
+          <w:tcPr>
+            <w:tcW w:type="dxa" w:w="4874"/>
+          </w:tcPr>
+          <w:p>
+            <w:pPr>
+              <w:spacing w:after="80" w:before="60"/>
+            </w:pPr>
+            <w:r>
+              <w:rPr>
+                <w:sz w:val="19"/>
+              </w:rPr>
+              <w:t>Verified frontend behaviour</w:t>
+            </w:r>
+          </w:p>
+        </w:tc>
+      </w:tr>
+      <w:tr>
+        <w:trPr>
+          <w:cantSplit/>
+        </w:trPr>
+        <w:tc>
+          <w:tcPr>
+            <w:tcW w:type="dxa" w:w="4874"/>
+          </w:tcPr>
+          <w:p>
+            <w:pPr>
+              <w:spacing w:after="80" w:before="60"/>
+            </w:pPr>
+            <w:r>
+              <w:rPr>
+                <w:sz w:val="19"/>
+              </w:rPr>
+              <w:t>Sign-in</w:t>
+            </w:r>
+          </w:p>
+        </w:tc>
+        <w:tc>
+          <w:tcPr>
+            <w:tcW w:type="dxa" w:w="4874"/>
+          </w:tcPr>
+          <w:p>
+            <w:pPr>
+              <w:spacing w:after="80" w:before="60"/>
+            </w:pPr>
+            <w:r>
+              <w:rPr>
+                <w:sz w:val="19"/>
+              </w:rPr>
+              <w:t>Email/password fields; demo-role selection; busy and error feedback; sign-out and session-expiry handling.</w:t>
+            </w:r>
+          </w:p>
+        </w:tc>
+      </w:tr>
+      <w:tr>
+        <w:trPr>
+          <w:cantSplit/>
+        </w:trPr>
+        <w:tc>
+          <w:tcPr>
+            <w:tcW w:type="dxa" w:w="4874"/>
+          </w:tcPr>
+          <w:p>
+            <w:pPr>
+              <w:spacing w:after="80" w:before="60"/>
+            </w:pPr>
+            <w:r>
+              <w:rPr>
+                <w:sz w:val="19"/>
+              </w:rPr>
+              <w:t>Projects</w:t>
+            </w:r>
+          </w:p>
+        </w:tc>
+        <w:tc>
+          <w:tcPr>
+            <w:tcW w:type="dxa" w:w="4874"/>
+          </w:tcPr>
+          <w:p>
+            <w:pPr>
+              <w:spacing w:after="80" w:before="60"/>
+            </w:pPr>
+            <w:r>
+              <w:rPr>
+                <w:sz w:val="19"/>
+              </w:rPr>
+              <w:t>Search by project, client or manager; order by deadline or name; result count, clear filters and open project.</w:t>
+            </w:r>
+          </w:p>
+        </w:tc>
+      </w:tr>
+      <w:tr>
+        <w:trPr>
+          <w:cantSplit/>
+        </w:trPr>
+        <w:tc>
+          <w:tcPr>
+            <w:tcW w:type="dxa" w:w="4874"/>
+          </w:tcPr>
+          <w:p>
+            <w:pPr>
+              <w:spacing w:after="80" w:before="60"/>
+            </w:pPr>
+            <w:r>
+              <w:rPr>
+                <w:sz w:val="19"/>
+              </w:rPr>
+              <w:t>Project details</w:t>
+            </w:r>
+          </w:p>
+        </w:tc>
+        <w:tc>
+          <w:tcPr>
+            <w:tcW w:type="dxa" w:w="4874"/>
+          </w:tcPr>
+          <w:p>
+            <w:pPr>
+              <w:spacing w:after="80" w:before="60"/>
+            </w:pPr>
+            <w:r>
+              <w:rPr>
+                <w:sz w:val="19"/>
+              </w:rPr>
+              <w:t>Client and scope summary, manager and delivery deadline; assigned task rows with search, owner filter where applicable, and deadline ordering.</w:t>
+            </w:r>
+          </w:p>
+        </w:tc>
+      </w:tr>
+      <w:tr>
+        <w:trPr>
+          <w:cantSplit/>
+        </w:trPr>
+        <w:tc>
+          <w:tcPr>
+            <w:tcW w:type="dxa" w:w="4874"/>
+          </w:tcPr>
+          <w:p>
+            <w:pPr>
+              <w:spacing w:after="80" w:before="60"/>
+            </w:pPr>
+            <w:r>
+              <w:rPr>
+                <w:sz w:val="19"/>
+              </w:rPr>
+              <w:t>Transcript-entry panel</w:t>
+            </w:r>
+          </w:p>
+        </w:tc>
+        <w:tc>
+          <w:tcPr>
+            <w:tcW w:type="dxa" w:w="4874"/>
+          </w:tcPr>
+          <w:p>
+            <w:pPr>
+              <w:spacing w:after="80" w:before="60"/>
+            </w:pPr>
+            <w:r>
+              <w:rPr>
+                <w:sz w:val="19"/>
+              </w:rPr>
+              <w:t>Administrator-only open/close panel; load one sample, paste/clear text, character count and submit; pending, validation and result feedback.</w:t>
+            </w:r>
+          </w:p>
+        </w:tc>
+      </w:tr>
+      <w:tr>
+        <w:trPr>
+          <w:cantSplit/>
+        </w:trPr>
+        <w:tc>
+          <w:tcPr>
+            <w:tcW w:type="dxa" w:w="4874"/>
+          </w:tcPr>
+          <w:p>
+            <w:pPr>
+              <w:spacing w:after="80" w:before="60"/>
+            </w:pPr>
+            <w:r>
+              <w:rPr>
+                <w:sz w:val="19"/>
+              </w:rPr>
+              <w:t>My Tasks</w:t>
+            </w:r>
+          </w:p>
+        </w:tc>
+        <w:tc>
+          <w:tcPr>
+            <w:tcW w:type="dxa" w:w="4874"/>
+          </w:tcPr>
+          <w:p>
+            <w:pPr>
+              <w:spacing w:after="80" w:before="60"/>
+            </w:pPr>
+            <w:r>
+              <w:rPr>
+                <w:sz w:val="19"/>
+              </w:rPr>
+              <w:t>Developer task list with scope, owner, deadline and estimated hours; search, date ordering and links to related projects.</w:t>
+            </w:r>
+          </w:p>
+        </w:tc>
+      </w:tr>
+      <w:tr>
+        <w:trPr>
+          <w:cantSplit/>
+        </w:trPr>
+        <w:tc>
+          <w:tcPr>
+            <w:tcW w:type="dxa" w:w="4874"/>
+          </w:tcPr>
+          <w:p>
+            <w:pPr>
+              <w:spacing w:after="80" w:before="60"/>
+            </w:pPr>
+            <w:r>
+              <w:rPr>
+                <w:sz w:val="19"/>
+              </w:rPr>
+              <w:t>Team directory</w:t>
+            </w:r>
+          </w:p>
+        </w:tc>
+        <w:tc>
+          <w:tcPr>
+            <w:tcW w:type="dxa" w:w="4874"/>
+          </w:tcPr>
+          <w:p>
+            <w:pPr>
+              <w:spacing w:after="80" w:before="60"/>
+            </w:pPr>
+            <w:r>
+              <w:rPr>
+                <w:sz w:val="19"/>
+              </w:rPr>
+              <w:t>Read-only member list with roles and specialization; name/skill search, role filtering and clear-filter recovery.</w:t>
+            </w:r>
+          </w:p>
+        </w:tc>
+      </w:tr>
+    </w:tbl>
+    <w:p>
+      <w:pPr>
+        <w:pStyle w:val="Heading1"/>
+      </w:pPr>
+      <w:r>
+        <w:t>3. Existing workflow and meaningful information</w:t>
       </w:r>
     </w:p>
     <w:p>
       <w:pPr>
         <w:spacing w:after="120"/>
-        <w:jc w:val="left"/>
       </w:pPr>
       <w:r>
         <w:rPr>
           <w:b w:val="0"/>
-          <w:sz w:val="21"/>
+          <w:sz w:val="20"/>
         </w:rPr>
-        <w:t>Implementation will use React 19, Vite, JavaScript, HTML and CSS. The scope covers frontend screens and interactions only. Existing APIs may be used where available; sample data will support the complete prototype. Backend, database and AI model development are excluded. Review, correction and planning views are proposed frontend extensions, not claims about existing repository functionality.</w:t>
+        <w:t>Administrator: Sign in → Projects → Create from Transcript → paste text or load the sample → submit → result notice → open project and inspect assigned tasks. Manager: Sign in → assigned Projects → project details and task filters. Developer: Sign in → My Tasks → related project. Team directory is available through workspace navigation.</w:t>
+      </w:r>
+    </w:p>
+    <w:p>
+      <w:pPr>
+        <w:spacing w:after="120"/>
+      </w:pPr>
+      <w:r>
+        <w:rPr>
+          <w:b w:val="0"/>
+          <w:sz w:val="20"/>
+        </w:rPr>
+        <w:t>Email/password identify the account; the transcript supplies meeting decisions; project scope explains the work; owners show responsibility; deadlines show delivery dates; estimated hours describe effort. Search and filter controls narrow permitted records. The owner filter appears only when more than one assignee is available.</w:t>
+      </w:r>
+    </w:p>
+    <w:p>
+      <w:pPr>
+        <w:spacing w:after="120"/>
+      </w:pPr>
+      <w:r>
+        <w:rPr>
+          <w:b w:val="0"/>
+          <w:sz w:val="18"/>
+        </w:rPr>
+        <w:t>Review basis: app/client/src/App.jsx, WorkLists.jsx, DemoAccounts.jsx, api.js and styles.css; repository README and docs/TESTING.md. Task detail is currently displayed within task rows; there is no separate task-detail screen. Sample loading and success notices are not standalone screens.</w:t>
+      </w:r>
+    </w:p>
+    <w:p>
+      <w:r>
+        <w:br w:type="page"/>
+      </w:r>
+    </w:p>
+    <w:p>
+      <w:pPr>
+        <w:spacing w:after="160"/>
+      </w:pPr>
+      <w:r>
+        <w:rPr>
+          <w:b/>
+          <w:sz w:val="34"/>
+        </w:rPr>
+        <w:t>Scope, Responsibilities and Delivery</w:t>
       </w:r>
     </w:p>
     <w:p>
@@ -290,7 +617,19 @@
         <w:pStyle w:val="Heading1"/>
       </w:pPr>
       <w:r>
-        <w:t>Individual responsibilities — 8 dynamic interfaces each</w:t>
+        <w:t>4. Two-member allocation — 16 interface units</w:t>
+      </w:r>
+    </w:p>
+    <w:p>
+      <w:pPr>
+        <w:spacing w:after="120"/>
+      </w:pPr>
+      <w:r>
+        <w:rPr>
+          <w:b w:val="0"/>
+          <w:sz w:val="20"/>
+        </w:rPr>
+        <w:t>The target is eight substantial interactive interfaces per member, within the required 7–10 range. I = implemented in the repository; P = proposed frontend work. This is the proposed academic division of responsibility, not a claim of past authorship. Existing inventory: five screen types and one substantial panel; remaining target: ten proposed interfaces.</w:t>
       </w:r>
     </w:p>
     <w:tbl>
@@ -356,7 +695,7 @@
               <w:rPr>
                 <w:sz w:val="18"/>
               </w:rPr>
-              <w:t>1. Sign-in — input checks and role routing</w:t>
+              <w:t>1. [I] Sign-in and session feedback</w:t>
             </w:r>
           </w:p>
         </w:tc>
@@ -372,7 +711,7 @@
               <w:rPr>
                 <w:sz w:val="18"/>
               </w:rPr>
-              <w:t>1. Assigned projects — manager search and filters</w:t>
+              <w:t>1. [I] My Tasks: search, ordering and project links</w:t>
             </w:r>
           </w:p>
         </w:tc>
@@ -393,7 +732,7 @@
               <w:rPr>
                 <w:sz w:val="18"/>
               </w:rPr>
-              <w:t>2. Admin projects — search, sort and open</w:t>
+              <w:t>2. [I] Projects: search, sort and navigation</w:t>
             </w:r>
           </w:p>
         </w:tc>
@@ -409,7 +748,7 @@
               <w:rPr>
                 <w:sz w:val="18"/>
               </w:rPr>
-              <w:t>2. My tasks — developer search and ordering</w:t>
+              <w:t>2. [I] Team directory: search and role filters</w:t>
             </w:r>
           </w:p>
         </w:tc>
@@ -430,7 +769,7 @@
               <w:rPr>
                 <w:sz w:val="18"/>
               </w:rPr>
-              <w:t>3. Project detail — inspect scope and tasks</w:t>
+              <w:t>3. [I] Project details and assigned-task filters</w:t>
             </w:r>
           </w:p>
         </w:tc>
@@ -446,7 +785,7 @@
               <w:rPr>
                 <w:sz w:val="18"/>
               </w:rPr>
-              <w:t>3. Task detail — scope, owner, deadline and hours</w:t>
+              <w:t>3. [P] Task-detail view: inspect one task in full</w:t>
             </w:r>
           </w:p>
         </w:tc>
@@ -467,7 +806,7 @@
               <w:rPr>
                 <w:sz w:val="18"/>
               </w:rPr>
-              <w:t>4. Transcript editor — input and validation</w:t>
+              <w:t>4. [I] Transcript-entry and submission panel</w:t>
             </w:r>
           </w:p>
         </w:tc>
@@ -483,7 +822,7 @@
               <w:rPr>
                 <w:sz w:val="18"/>
               </w:rPr>
-              <w:t>4. Team directory — search and role filters</w:t>
+              <w:t>4. [P] Employee profile: inspect permitted assignments</w:t>
             </w:r>
           </w:p>
         </w:tc>
@@ -504,7 +843,7 @@
               <w:rPr>
                 <w:sz w:val="18"/>
               </w:rPr>
-              <w:t>5. Sample meeting selector — preview and load</w:t>
+              <w:t>5. [P] Draft review: inspect extracted projects/tasks</w:t>
             </w:r>
           </w:p>
         </w:tc>
@@ -520,7 +859,7 @@
               <w:rPr>
                 <w:sz w:val="18"/>
               </w:rPr>
-              <w:t>5. Employee profile — inspect assigned work</w:t>
+              <w:t>5. [P] Manager overview: select assigned projects and deadlines</w:t>
             </w:r>
           </w:p>
         </w:tc>
@@ -541,7 +880,7 @@
               <w:rPr>
                 <w:sz w:val="18"/>
               </w:rPr>
-              <w:t>6. Extraction review — inspect project/task draft</w:t>
+              <w:t>6. [P] Draft correction: edit owners, dates and hours</w:t>
             </w:r>
           </w:p>
         </w:tc>
@@ -557,7 +896,7 @@
               <w:rPr>
                 <w:sz w:val="18"/>
               </w:rPr>
-              <w:t>6. Deadline calendar — navigate and filter dates</w:t>
+              <w:t>6. [P] Deadline calendar: navigate dates and filter work</w:t>
             </w:r>
           </w:p>
         </w:tc>
@@ -578,7 +917,7 @@
               <w:rPr>
                 <w:sz w:val="18"/>
               </w:rPr>
-              <w:t>7. Draft correction — edit owners, dates and hours</w:t>
+              <w:t>7. [P] Creation results: inspect batch and open projects</w:t>
             </w:r>
           </w:p>
         </w:tc>
@@ -594,7 +933,7 @@
               <w:rPr>
                 <w:sz w:val="18"/>
               </w:rPr>
-              <w:t>7. Workload overview — compare assignee hours</w:t>
+              <w:t>7. [P] Workload view: compare permitted assignee hours</w:t>
             </w:r>
           </w:p>
         </w:tc>
@@ -615,7 +954,7 @@
               <w:rPr>
                 <w:sz w:val="18"/>
               </w:rPr>
-              <w:t>8. Creation summary — inspect results and open work</w:t>
+              <w:t>8. [P] Meeting history: browse prior submissions</w:t>
             </w:r>
           </w:p>
         </w:tc>
@@ -631,7 +970,7 @@
               <w:rPr>
                 <w:sz w:val="18"/>
               </w:rPr>
-              <w:t>8. Effort summary — filter project/task estimates</w:t>
+              <w:t>8. [P] Effort summary: compare project/task estimates</w:t>
             </w:r>
           </w:p>
         </w:tc>
@@ -639,15 +978,14 @@
     </w:tbl>
     <w:p>
       <w:pPr>
-        <w:spacing w:after="80"/>
-        <w:jc w:val="left"/>
+        <w:spacing w:after="120"/>
       </w:pPr>
       <w:r>
         <w:rPr>
           <w:b w:val="0"/>
           <w:sz w:val="18"/>
         </w:rPr>
-        <w:t>Each numbered item is a distinct interactive screen or substantial view. Filters, responsive variants and loading/error states do not count as additional interfaces. Both members will integrate navigation and review design consistency.</w:t>
+        <w:t>Responsive versions, role variants, search results, sample-load buttons and loading/error notices will not inflate the count. Proposed interfaces must have a distinct purpose and meaningful interaction. The existing panel counts as a substantial interface, subject to the instructor’s interpretation.</w:t>
       </w:r>
     </w:p>
     <w:p>
@@ -655,33 +993,75 @@
         <w:pStyle w:val="Heading1"/>
       </w:pPr>
       <w:r>
-        <w:t>User flow and deliverables</w:t>
+        <w:t>5. Planned flow and integration limits</w:t>
       </w:r>
     </w:p>
     <w:p>
       <w:pPr>
         <w:spacing w:after="120"/>
-        <w:jc w:val="left"/>
       </w:pPr>
       <w:r>
         <w:rPr>
           <w:b w:val="0"/>
           <w:sz w:val="20"/>
         </w:rPr>
-        <w:t>Administrator: Sign in → projects → transcript → review/correct draft → creation summary → project detail. Manager: Assigned projects → project detail → workload/calendar. Developer: My tasks → task detail → related project. Team views connect the directory to employee assignments.</w:t>
+        <w:t>The proposed administrator journey adds draft review and correction before a simulated confirmation, followed by a dedicated results view. Meeting history will provide a route back to earlier submission summaries. Proposed team views will connect project/task context to employee assignments, date-based planning and effort summaries. Both members will integrate navigation and maintain consistent components.</w:t>
       </w:r>
     </w:p>
     <w:p>
       <w:pPr>
         <w:spacing w:after="120"/>
-        <w:jc w:val="left"/>
       </w:pPr>
       <w:r>
         <w:rPr>
           <w:b w:val="0"/>
           <w:sz w:val="20"/>
         </w:rPr>
-        <w:t>By the Mid Lab Exam, all 16 screens and connected user flows will be complete as navigable mockups with representative data. Every field will have a clear purpose, appropriate label and relevant feedback. Final delivery will refine interactions, responsiveness and consistency. Any class presentation will be optional and require both members’ agreement.</w:t>
+        <w:t>These extensions are not currently implemented. The current transcript endpoint processes and saves in one request; there is no separate review-before-save API. Review/correction and history will therefore use labelled local fixtures unless an existing suitable service is available. Workload and effort views will summarize estimated hours, not actual time, progress or billing. Sample screens must preserve the intended role boundaries.</w:t>
+      </w:r>
+    </w:p>
+    <w:p>
+      <w:pPr>
+        <w:pStyle w:val="Heading1"/>
+      </w:pPr>
+      <w:r>
+        <w:t>6. Mid-lab milestone and quality criteria</w:t>
+      </w:r>
+    </w:p>
+    <w:p>
+      <w:pPr>
+        <w:spacing w:after="120"/>
+      </w:pPr>
+      <w:r>
+        <w:rPr>
+          <w:b w:val="0"/>
+          <w:sz w:val="20"/>
+        </w:rPr>
+        <w:t>By the Mid Lab Exam, the target is all 16 interfaces connected as navigable frontend screens or mockups with representative data. Every field must have a clear purpose and label; every primary action must lead to an understandable result. No unnecessary fields will be added. Shared search/filter components and navigation will be integrated by both members.</w:t>
+      </w:r>
+    </w:p>
+    <w:p>
+      <w:pPr>
+        <w:spacing w:after="120"/>
+      </w:pPr>
+      <w:r>
+        <w:rPr>
+          <w:b w:val="0"/>
+          <w:sz w:val="20"/>
+        </w:rPr>
+        <w:t>Acceptance checks: complete each role’s journey; verify project/task links, search, sorting and clear-filter recovery; distinguish empty data from no matches; provide readable invalid-input, loading and retry states; check keyboard focus and phone/desktop layouts. A production frontend build must pass. Static preview data must not be presented as live AI execution or saved records.</w:t>
+      </w:r>
+    </w:p>
+    <w:p>
+      <w:pPr>
+        <w:spacing w:after="120"/>
+      </w:pPr>
+      <w:r>
+        <w:rPr>
+          <w:b w:val="0"/>
+          <w:sz w:val="20"/>
+        </w:rPr>
+        <w:t>Final delivery will include the frontend source and a concise walkthrough of each member’s interfaces, with remaining mockup-only behaviour clearly identified. Presentations will be optional and held only with both members’ agreement. The repository currently does not establish completion of the full 16-interface target.</w:t>
       </w:r>
     </w:p>
     <w:sectPr>

</xml_diff>